<commit_message>
Menambahkan folder dan tugas pertemuan
</commit_message>
<xml_diff>
--- a/P03.docx
+++ b/P03.docx
@@ -3370,7 +3370,39 @@
           <w:rFonts w:cs="Carlito"/>
           <w:sz w:val="20"/>
         </w:rPr>
-        <w:t xml:space="preserve">Rencana yang baru Anda tulis </w:t>
+        <w:t xml:space="preserve">Rencana yang </w:t>
+      </w:r>
+      <w:proofErr w:type="spellStart"/>
+      <w:r>
+        <w:rPr>
+          <w:rFonts w:cs="Carlito"/>
+          <w:sz w:val="20"/>
+        </w:rPr>
+        <w:t>baru</w:t>
+      </w:r>
+      <w:proofErr w:type="spellEnd"/>
+      <w:r>
+        <w:rPr>
+          <w:rFonts w:cs="Carlito"/>
+          <w:sz w:val="20"/>
+        </w:rPr>
+        <w:t xml:space="preserve"> Anda </w:t>
+      </w:r>
+      <w:proofErr w:type="spellStart"/>
+      <w:r>
+        <w:rPr>
+          <w:rFonts w:cs="Carlito"/>
+          <w:sz w:val="20"/>
+        </w:rPr>
+        <w:t>tulis</w:t>
+      </w:r>
+      <w:proofErr w:type="spellEnd"/>
+      <w:r>
+        <w:rPr>
+          <w:rFonts w:cs="Carlito"/>
+          <w:sz w:val="20"/>
+        </w:rPr>
+        <w:t xml:space="preserve"> </w:t>
       </w:r>
       <w:proofErr w:type="spellStart"/>
       <w:r>
@@ -5296,6 +5328,12 @@
             <w:pPr>
               <w:spacing w:before="20" w:after="20" w:line="252" w:lineRule="auto"/>
             </w:pPr>
+            <w:r>
+              <w:rPr>
+                <w:rFonts w:ascii="Segoe UI Symbol" w:hAnsi="Segoe UI Symbol" w:cs="Segoe UI Symbol"/>
+              </w:rPr>
+              <w:t>✓</w:t>
+            </w:r>
           </w:p>
         </w:tc>
       </w:tr>
@@ -5344,6 +5382,12 @@
             <w:pPr>
               <w:spacing w:before="20" w:after="20" w:line="252" w:lineRule="auto"/>
             </w:pPr>
+            <w:r>
+              <w:rPr>
+                <w:rFonts w:ascii="Segoe UI Symbol" w:hAnsi="Segoe UI Symbol" w:cs="Segoe UI Symbol"/>
+              </w:rPr>
+              <w:t>✓</w:t>
+            </w:r>
           </w:p>
         </w:tc>
       </w:tr>
@@ -5390,6 +5434,12 @@
             <w:pPr>
               <w:spacing w:before="20" w:after="20" w:line="252" w:lineRule="auto"/>
             </w:pPr>
+            <w:r>
+              <w:rPr>
+                <w:rFonts w:ascii="Segoe UI Symbol" w:hAnsi="Segoe UI Symbol" w:cs="Segoe UI Symbol"/>
+              </w:rPr>
+              <w:t>✓</w:t>
+            </w:r>
           </w:p>
         </w:tc>
       </w:tr>
@@ -6270,6 +6320,12 @@
             <w:pPr>
               <w:spacing w:before="20" w:after="20" w:line="252" w:lineRule="auto"/>
             </w:pPr>
+            <w:r>
+              <w:rPr>
+                <w:rFonts w:ascii="Segoe UI Symbol" w:hAnsi="Segoe UI Symbol" w:cs="Segoe UI Symbol"/>
+              </w:rPr>
+              <w:t>✓</w:t>
+            </w:r>
           </w:p>
         </w:tc>
       </w:tr>
@@ -6342,6 +6398,12 @@
             <w:pPr>
               <w:spacing w:before="20" w:after="20" w:line="252" w:lineRule="auto"/>
             </w:pPr>
+            <w:r>
+              <w:rPr>
+                <w:rFonts w:ascii="Segoe UI Symbol" w:hAnsi="Segoe UI Symbol" w:cs="Segoe UI Symbol"/>
+              </w:rPr>
+              <w:t>✓</w:t>
+            </w:r>
           </w:p>
         </w:tc>
       </w:tr>
@@ -6411,6 +6473,12 @@
             <w:pPr>
               <w:spacing w:before="20" w:after="20" w:line="252" w:lineRule="auto"/>
             </w:pPr>
+            <w:r>
+              <w:rPr>
+                <w:rFonts w:ascii="Segoe UI Symbol" w:hAnsi="Segoe UI Symbol" w:cs="Segoe UI Symbol"/>
+              </w:rPr>
+              <w:t>✓</w:t>
+            </w:r>
           </w:p>
         </w:tc>
       </w:tr>
@@ -7925,6 +7993,12 @@
             <w:pPr>
               <w:spacing w:before="20" w:after="20" w:line="252" w:lineRule="auto"/>
             </w:pPr>
+            <w:r>
+              <w:rPr>
+                <w:rFonts w:ascii="Segoe UI Symbol" w:hAnsi="Segoe UI Symbol" w:cs="Segoe UI Symbol"/>
+              </w:rPr>
+              <w:t>✓</w:t>
+            </w:r>
           </w:p>
         </w:tc>
       </w:tr>
@@ -7997,6 +8071,12 @@
             <w:pPr>
               <w:spacing w:before="20" w:after="20" w:line="252" w:lineRule="auto"/>
             </w:pPr>
+            <w:r>
+              <w:rPr>
+                <w:rFonts w:ascii="Segoe UI Symbol" w:hAnsi="Segoe UI Symbol" w:cs="Segoe UI Symbol"/>
+              </w:rPr>
+              <w:t>✓</w:t>
+            </w:r>
           </w:p>
         </w:tc>
       </w:tr>
@@ -8067,6 +8147,20 @@
             <w:pPr>
               <w:spacing w:before="20" w:after="20" w:line="252" w:lineRule="auto"/>
             </w:pPr>
+            <w:proofErr w:type="spellStart"/>
+            <w:r>
+              <w:t>Sudah</w:t>
+            </w:r>
+            <w:proofErr w:type="spellEnd"/>
+            <w:r>
+              <w:t xml:space="preserve"> </w:t>
+            </w:r>
+            <w:r>
+              <w:rPr>
+                <w:rFonts w:ascii="Segoe UI Symbol" w:hAnsi="Segoe UI Symbol" w:cs="Segoe UI Symbol"/>
+              </w:rPr>
+              <w:t>✓</w:t>
+            </w:r>
           </w:p>
         </w:tc>
       </w:tr>
@@ -8139,6 +8233,20 @@
             <w:pPr>
               <w:spacing w:before="20" w:after="20" w:line="252" w:lineRule="auto"/>
             </w:pPr>
+            <w:proofErr w:type="spellStart"/>
+            <w:r>
+              <w:t>Sudah</w:t>
+            </w:r>
+            <w:proofErr w:type="spellEnd"/>
+            <w:r>
+              <w:t xml:space="preserve"> </w:t>
+            </w:r>
+            <w:r>
+              <w:rPr>
+                <w:rFonts w:ascii="Segoe UI Symbol" w:hAnsi="Segoe UI Symbol" w:cs="Segoe UI Symbol"/>
+              </w:rPr>
+              <w:t>✓</w:t>
+            </w:r>
           </w:p>
         </w:tc>
       </w:tr>
@@ -8208,6 +8316,20 @@
             <w:pPr>
               <w:spacing w:before="20" w:after="20" w:line="252" w:lineRule="auto"/>
             </w:pPr>
+            <w:proofErr w:type="spellStart"/>
+            <w:r>
+              <w:t>Sudah</w:t>
+            </w:r>
+            <w:proofErr w:type="spellEnd"/>
+            <w:r>
+              <w:t xml:space="preserve"> </w:t>
+            </w:r>
+            <w:r>
+              <w:rPr>
+                <w:rFonts w:ascii="Segoe UI Symbol" w:hAnsi="Segoe UI Symbol" w:cs="Segoe UI Symbol"/>
+              </w:rPr>
+              <w:t>✓</w:t>
+            </w:r>
           </w:p>
         </w:tc>
       </w:tr>
@@ -8280,6 +8402,20 @@
             <w:pPr>
               <w:spacing w:before="20" w:after="20" w:line="252" w:lineRule="auto"/>
             </w:pPr>
+            <w:proofErr w:type="spellStart"/>
+            <w:r>
+              <w:t>Sudah</w:t>
+            </w:r>
+            <w:proofErr w:type="spellEnd"/>
+            <w:r>
+              <w:t xml:space="preserve"> </w:t>
+            </w:r>
+            <w:r>
+              <w:rPr>
+                <w:rFonts w:ascii="Segoe UI Symbol" w:hAnsi="Segoe UI Symbol" w:cs="Segoe UI Symbol"/>
+              </w:rPr>
+              <w:t>✓</w:t>
+            </w:r>
           </w:p>
         </w:tc>
       </w:tr>
@@ -8349,6 +8485,20 @@
             <w:pPr>
               <w:spacing w:before="20" w:after="20" w:line="252" w:lineRule="auto"/>
             </w:pPr>
+            <w:proofErr w:type="spellStart"/>
+            <w:r>
+              <w:t>Sudah</w:t>
+            </w:r>
+            <w:proofErr w:type="spellEnd"/>
+            <w:r>
+              <w:t xml:space="preserve"> </w:t>
+            </w:r>
+            <w:r>
+              <w:rPr>
+                <w:rFonts w:ascii="Segoe UI Symbol" w:hAnsi="Segoe UI Symbol" w:cs="Segoe UI Symbol"/>
+              </w:rPr>
+              <w:t>✓</w:t>
+            </w:r>
           </w:p>
         </w:tc>
       </w:tr>
@@ -10060,6 +10210,90 @@
           <w:p>
             <w:pPr>
               <w:spacing w:before="20" w:after="20" w:line="252" w:lineRule="auto"/>
+              <w:rPr>
+                <w:lang w:val="en-ID"/>
+              </w:rPr>
+            </w:pPr>
+            <w:r>
+              <w:rPr>
+                <w:lang w:val="en-ID"/>
+              </w:rPr>
+              <w:t>alt="</w:t>
+            </w:r>
+            <w:proofErr w:type="spellStart"/>
+            <w:r>
+              <w:rPr>
+                <w:lang w:val="en-ID"/>
+              </w:rPr>
+              <w:t>tentang</w:t>
+            </w:r>
+            <w:proofErr w:type="spellEnd"/>
+            <w:r>
+              <w:rPr>
+                <w:lang w:val="en-ID"/>
+              </w:rPr>
+              <w:t xml:space="preserve"> </w:t>
+            </w:r>
+            <w:proofErr w:type="spellStart"/>
+            <w:r>
+              <w:rPr>
+                <w:lang w:val="en-ID"/>
+              </w:rPr>
+              <w:t>wanita</w:t>
+            </w:r>
+            <w:proofErr w:type="spellEnd"/>
+            <w:r>
+              <w:rPr>
+                <w:lang w:val="en-ID"/>
+              </w:rPr>
+              <w:t xml:space="preserve"> </w:t>
+            </w:r>
+            <w:proofErr w:type="spellStart"/>
+            <w:r>
+              <w:rPr>
+                <w:lang w:val="en-ID"/>
+              </w:rPr>
+              <w:t>modis</w:t>
+            </w:r>
+            <w:proofErr w:type="spellEnd"/>
+            <w:r>
+              <w:rPr>
+                <w:lang w:val="en-ID"/>
+              </w:rPr>
+              <w:t xml:space="preserve"> yang </w:t>
+            </w:r>
+            <w:proofErr w:type="spellStart"/>
+            <w:r>
+              <w:rPr>
+                <w:lang w:val="en-ID"/>
+              </w:rPr>
+              <w:t>menjadi</w:t>
+            </w:r>
+            <w:proofErr w:type="spellEnd"/>
+            <w:r>
+              <w:rPr>
+                <w:lang w:val="en-ID"/>
+              </w:rPr>
+              <w:t xml:space="preserve"> </w:t>
+            </w:r>
+            <w:proofErr w:type="spellStart"/>
+            <w:r>
+              <w:rPr>
+                <w:lang w:val="en-ID"/>
+              </w:rPr>
+              <w:t>ibu</w:t>
+            </w:r>
+            <w:proofErr w:type="spellEnd"/>
+            <w:r>
+              <w:rPr>
+                <w:lang w:val="en-ID"/>
+              </w:rPr>
+              <w:t xml:space="preserve"> asrama"</w:t>
+            </w:r>
+          </w:p>
+          <w:p>
+            <w:pPr>
+              <w:spacing w:before="20" w:after="20" w:line="252" w:lineRule="auto"/>
             </w:pPr>
           </w:p>
         </w:tc>
@@ -10077,6 +10311,20 @@
             <w:pPr>
               <w:spacing w:before="20" w:after="20" w:line="252" w:lineRule="auto"/>
             </w:pPr>
+            <w:proofErr w:type="spellStart"/>
+            <w:r>
+              <w:t>Sudah</w:t>
+            </w:r>
+            <w:proofErr w:type="spellEnd"/>
+            <w:r>
+              <w:t xml:space="preserve"> </w:t>
+            </w:r>
+            <w:r>
+              <w:rPr>
+                <w:rFonts w:ascii="Segoe UI Symbol" w:hAnsi="Segoe UI Symbol" w:cs="Segoe UI Symbol"/>
+              </w:rPr>
+              <w:t>✓</w:t>
+            </w:r>
           </w:p>
         </w:tc>
       </w:tr>
@@ -12771,6 +13019,9 @@
             <w:pPr>
               <w:spacing w:before="20" w:after="20" w:line="252" w:lineRule="auto"/>
             </w:pPr>
+            <w:r>
+              <w:t>90</w:t>
+            </w:r>
           </w:p>
         </w:tc>
         <w:tc>
@@ -12787,6 +13038,43 @@
             <w:pPr>
               <w:spacing w:before="20" w:after="20" w:line="252" w:lineRule="auto"/>
             </w:pPr>
+            <w:r>
+              <w:drawing>
+                <wp:inline distT="0" distB="0" distL="0" distR="0" wp14:anchorId="1B1999B1" wp14:editId="4029DF09">
+                  <wp:extent cx="2742565" cy="1697355"/>
+                  <wp:effectExtent l="0" t="0" r="635" b="0"/>
+                  <wp:docPr id="997489661" name="Picture 1"/>
+                  <wp:cNvGraphicFramePr>
+                    <a:graphicFrameLocks xmlns:a="http://schemas.openxmlformats.org/drawingml/2006/main" noChangeAspect="1"/>
+                  </wp:cNvGraphicFramePr>
+                  <a:graphic xmlns:a="http://schemas.openxmlformats.org/drawingml/2006/main">
+                    <a:graphicData uri="http://schemas.openxmlformats.org/drawingml/2006/picture">
+                      <pic:pic xmlns:pic="http://schemas.openxmlformats.org/drawingml/2006/picture">
+                        <pic:nvPicPr>
+                          <pic:cNvPr id="997489661" name=""/>
+                          <pic:cNvPicPr/>
+                        </pic:nvPicPr>
+                        <pic:blipFill>
+                          <a:blip r:embed="rId8"/>
+                          <a:stretch>
+                            <a:fillRect/>
+                          </a:stretch>
+                        </pic:blipFill>
+                        <pic:spPr>
+                          <a:xfrm>
+                            <a:off x="0" y="0"/>
+                            <a:ext cx="2742565" cy="1697355"/>
+                          </a:xfrm>
+                          <a:prstGeom prst="rect">
+                            <a:avLst/>
+                          </a:prstGeom>
+                        </pic:spPr>
+                      </pic:pic>
+                    </a:graphicData>
+                  </a:graphic>
+                </wp:inline>
+              </w:drawing>
+            </w:r>
           </w:p>
         </w:tc>
       </w:tr>
@@ -19550,7 +19838,7 @@
       </w:pPr>
     </w:p>
     <w:sectPr>
-      <w:footerReference w:type="default" r:id="rId8"/>
+      <w:footerReference w:type="default" r:id="rId9"/>
       <w:pgSz w:w="11906" w:h="16838"/>
       <w:pgMar w:top="964" w:right="1077" w:bottom="907" w:left="1077" w:header="720" w:footer="720" w:gutter="0"/>
       <w:cols w:space="720"/>

</xml_diff>